<commit_message>
Add recruitment agencies to setup guide docx
</commit_message>
<xml_diff>
--- a/docs/Job-Application-Agent-Setup-Guide.docx
+++ b/docs/Job-Application-Agent-Setup-Guide.docx
@@ -2163,6 +2163,154 @@
           </w:p>
         </w:tc>
       </w:tr>
+      <w:tr>
+        <w:tc>
+          <w:tcPr>
+            <w:tcW w:type="dxa" w:w="2200"/>
+            <w:tcMar>
+              <w:top w:type="dxa" w:w="80"/>
+              <w:left w:type="dxa" w:w="100"/>
+              <w:bottom w:type="dxa" w:w="80"/>
+              <w:right w:type="dxa" w:w="100"/>
+            </w:tcMar>
+          </w:tcPr>
+          <w:p>
+            <w:r>
+              <w:rPr>
+                <w:rFonts w:ascii="Calibri" w:cs="Calibri" w:eastAsia="Calibri" w:hAnsi="Calibri"/>
+                <w:b w:val="false"/>
+                <w:bCs w:val="false"/>
+                <w:color w:val="000000"/>
+                <w:sz w:val="20"/>
+                <w:szCs w:val="20"/>
+              </w:rPr>
+              <w:t xml:space="preserve">Michael Page / Randstad / ManpowerGroup</w:t>
+            </w:r>
+          </w:p>
+        </w:tc>
+        <w:tc>
+          <w:tcPr>
+            <w:tcW w:type="dxa" w:w="2000"/>
+            <w:tcMar>
+              <w:top w:type="dxa" w:w="80"/>
+              <w:left w:type="dxa" w:w="100"/>
+              <w:bottom w:type="dxa" w:w="80"/>
+              <w:right w:type="dxa" w:w="100"/>
+            </w:tcMar>
+          </w:tcPr>
+          <w:p>
+            <w:r>
+              <w:rPr>
+                <w:rFonts w:ascii="Calibri" w:cs="Calibri" w:eastAsia="Calibri" w:hAnsi="Calibri"/>
+                <w:b w:val="false"/>
+                <w:bCs w:val="false"/>
+                <w:color w:val="000000"/>
+                <w:sz w:val="20"/>
+                <w:szCs w:val="20"/>
+              </w:rPr>
+              <w:t xml:space="preserve">Recruitment Agency / Global</w:t>
+            </w:r>
+          </w:p>
+        </w:tc>
+        <w:tc>
+          <w:tcPr>
+            <w:tcW w:type="dxa" w:w="5100"/>
+            <w:tcMar>
+              <w:top w:type="dxa" w:w="80"/>
+              <w:left w:type="dxa" w:w="100"/>
+              <w:bottom w:type="dxa" w:w="80"/>
+              <w:right w:type="dxa" w:w="100"/>
+            </w:tcMar>
+          </w:tcPr>
+          <w:p>
+            <w:r>
+              <w:rPr>
+                <w:rFonts w:ascii="Calibri" w:cs="Calibri" w:eastAsia="Calibri" w:hAnsi="Calibri"/>
+                <w:b w:val="false"/>
+                <w:bCs w:val="false"/>
+                <w:color w:val="000000"/>
+                <w:sz w:val="20"/>
+                <w:szCs w:val="20"/>
+              </w:rPr>
+              <w:t xml:space="preserve">International staffing and executive-search firms with a strong India presence; work mid-to-senior placements across finance, tech, sales, and leadership roles.</w:t>
+            </w:r>
+          </w:p>
+        </w:tc>
+      </w:tr>
+      <w:tr>
+        <w:tc>
+          <w:tcPr>
+            <w:tcW w:type="dxa" w:w="2200"/>
+            <w:tcMar>
+              <w:top w:type="dxa" w:w="80"/>
+              <w:left w:type="dxa" w:w="100"/>
+              <w:bottom w:type="dxa" w:w="80"/>
+              <w:right w:type="dxa" w:w="100"/>
+            </w:tcMar>
+          </w:tcPr>
+          <w:p>
+            <w:r>
+              <w:rPr>
+                <w:rFonts w:ascii="Calibri" w:cs="Calibri" w:eastAsia="Calibri" w:hAnsi="Calibri"/>
+                <w:b w:val="false"/>
+                <w:bCs w:val="false"/>
+                <w:color w:val="000000"/>
+                <w:sz w:val="20"/>
+                <w:szCs w:val="20"/>
+              </w:rPr>
+              <w:t xml:space="preserve">ABC Consultants / TeamLease / CIEL HR</w:t>
+            </w:r>
+          </w:p>
+        </w:tc>
+        <w:tc>
+          <w:tcPr>
+            <w:tcW w:type="dxa" w:w="2000"/>
+            <w:tcMar>
+              <w:top w:type="dxa" w:w="80"/>
+              <w:left w:type="dxa" w:w="100"/>
+              <w:bottom w:type="dxa" w:w="80"/>
+              <w:right w:type="dxa" w:w="100"/>
+            </w:tcMar>
+          </w:tcPr>
+          <w:p>
+            <w:r>
+              <w:rPr>
+                <w:rFonts w:ascii="Calibri" w:cs="Calibri" w:eastAsia="Calibri" w:hAnsi="Calibri"/>
+                <w:b w:val="false"/>
+                <w:bCs w:val="false"/>
+                <w:color w:val="000000"/>
+                <w:sz w:val="20"/>
+                <w:szCs w:val="20"/>
+              </w:rPr>
+              <w:t xml:space="preserve">Recruitment Agency / India</w:t>
+            </w:r>
+          </w:p>
+        </w:tc>
+        <w:tc>
+          <w:tcPr>
+            <w:tcW w:type="dxa" w:w="5100"/>
+            <w:tcMar>
+              <w:top w:type="dxa" w:w="80"/>
+              <w:left w:type="dxa" w:w="100"/>
+              <w:bottom w:type="dxa" w:w="80"/>
+              <w:right w:type="dxa" w:w="100"/>
+            </w:tcMar>
+          </w:tcPr>
+          <w:p>
+            <w:r>
+              <w:rPr>
+                <w:rFonts w:ascii="Calibri" w:cs="Calibri" w:eastAsia="Calibri" w:hAnsi="Calibri"/>
+                <w:b w:val="false"/>
+                <w:bCs w:val="false"/>
+                <w:color w:val="000000"/>
+                <w:sz w:val="20"/>
+                <w:szCs w:val="20"/>
+              </w:rPr>
+              <w:t xml:space="preserve">India-founded staffing and executive-search firms — ABC Consultants (leadership hiring, since 1969) and TeamLease and CIEL HR (staffing, RPO, and talent-advisory work) are among the longest-established.</w:t>
+            </w:r>
+          </w:p>
+        </w:tc>
+      </w:tr>
     </w:tbl>
     <w:p>
       <w:pPr>
@@ -2184,6 +2332,28 @@
           <w:szCs w:val="20"/>
         </w:rPr>
         <w:t xml:space="preserve">“AI-native” auto-apply tools are worth naming here specifically because they can work against this system's core principle: several market themselves on submitting applications automatically on your behalf. If you use one for discovery, keep its auto-apply features switched off and route anything worth pursuing back through your own tailoring-and-review step instead.</w:t>
+      </w:r>
+    </w:p>
+    <w:p>
+      <w:pPr>
+        <w:spacing w:before="120"/>
+      </w:pPr>
+    </w:p>
+    <w:p>
+      <w:pPr>
+        <w:spacing w:after="200"/>
+        <w:ind w:left="288"/>
+      </w:pPr>
+      <w:r>
+        <w:rPr>
+          <w:rFonts w:ascii="Calibri" w:cs="Calibri" w:eastAsia="Calibri" w:hAnsi="Calibri"/>
+          <w:i/>
+          <w:iCs/>
+          <w:color w:val="555555"/>
+          <w:sz w:val="20"/>
+          <w:szCs w:val="20"/>
+        </w:rPr>
+        <w:t xml:space="preserve">Recruitment agencies work differently from the platforms above: you typically register or submit your resume once, and a recruiter matches you to roles behind the scenes, rather than you finding and applying to a specific posting yourself. This system's usual workflow — log a posting, tailor a resume to its JD, track it — doesn't map cleanly onto that; treat an agency placement more like a company you're exploring than a tracked job posting, and log outcomes in companies-to-explore.xlsx or as manual notes rather than forcing it into the Opportunities sheet.</w:t>
       </w:r>
     </w:p>
     <w:p>

</xml_diff>